<commit_message>
Rebuild localized NIST editions and render final figure QA sheets
</commit_message>
<xml_diff>
--- a/01-foundations/NIST_CSF_2/Portugues_BR/NIST_CSF_2_Practical_GRC_and_Junior_Analyst_Manual_Portugues_BR_v1.0.docx
+++ b/01-foundations/NIST_CSF_2/Portugues_BR/NIST_CSF_2_Practical_GRC_and_Junior_Analyst_Manual_Portugues_BR_v1.0.docx
@@ -5320,7 +5320,7 @@
       </w:r>
     </w:p>
     <w:bookmarkEnd w:id="118"/>
-    <w:bookmarkStart w:id="121" w:name="Xf605b9fc117b19fa96e3f4b67bb70a588b3ef93"/>
+    <w:bookmarkStart w:id="123" w:name="Xf605b9fc117b19fa96e3f4b67bb70a588b3ef93"/>
     <w:p>
       <w:pPr>
         <w:pStyle w:val="Heading1"/>
@@ -5343,8 +5343,58 @@
     </w:p>
     <w:p>
       <w:pPr>
-        <w:pStyle w:val="FirstParagraph"/>
-      </w:pPr>
+        <w:pStyle w:val="CaptionedFigure"/>
+      </w:pPr>
+      <w:r>
+        <w:drawing>
+          <wp:inline>
+            <wp:extent cx="5334000" cy="2963333"/>
+            <wp:effectExtent b="0" l="0" r="0" t="0"/>
+            <wp:docPr descr="Autorização, validação, ação corretiva e reteste transformam a saída técnica em evidência útil." title="" id="119" name="Picture"/>
+            <a:graphic>
+              <a:graphicData uri="http://schemas.openxmlformats.org/drawingml/2006/picture">
+                <pic:pic>
+                  <pic:nvPicPr>
+                    <pic:cNvPr descr="media/image1_pt-BR.png" id="120" name="Picture"/>
+                    <pic:cNvPicPr>
+                      <a:picLocks noChangeArrowheads="1" noChangeAspect="1"/>
+                    </pic:cNvPicPr>
+                  </pic:nvPicPr>
+                  <pic:blipFill>
+                    <a:blip r:embed="rId24"/>
+                    <a:stretch>
+                      <a:fillRect/>
+                    </a:stretch>
+                  </pic:blipFill>
+                  <pic:spPr bwMode="auto">
+                    <a:xfrm>
+                      <a:off x="0" y="0"/>
+                      <a:ext cx="5334000" cy="2963333"/>
+                    </a:xfrm>
+                    <a:prstGeom prst="rect">
+                      <a:avLst/>
+                    </a:prstGeom>
+                    <a:noFill/>
+                    <a:ln w="9525">
+                      <a:noFill/>
+                      <a:headEnd/>
+                      <a:tailEnd/>
+                    </a:ln>
+                  </pic:spPr>
+                </pic:pic>
+              </a:graphicData>
+            </a:graphic>
+          </wp:inline>
+        </w:drawing>
+      </w:r>
+    </w:p>
+    <w:p>
+      <w:pPr>
+        <w:pStyle w:val="ImageCaption"/>
+      </w:pPr>
+      <w:r>
+        <w:t xml:space="preserve">Autorização, validação, ação corretiva e reteste transformam a saída técnica em evidência útil.</w:t>
+      </w:r>
     </w:p>
     <w:p>
       <w:pPr>
@@ -5354,7 +5404,7 @@
         <w:t xml:space="preserve">Figura 7. Da saída da ferramenta à evidência</w:t>
       </w:r>
     </w:p>
-    <w:bookmarkStart w:id="119" w:name="ferramenta-purpose-possible-csf-support"/>
+    <w:bookmarkStart w:id="121" w:name="ferramenta-purpose-possible-csf-support"/>
     <w:p>
       <w:pPr>
         <w:pStyle w:val="Heading2"/>
@@ -5467,8 +5517,8 @@
         <w:t xml:space="preserve">Pesquisa, análise, painéis e monitoramento de segurança □ DE.CM, DE.AE, GV.OV</w:t>
       </w:r>
     </w:p>
-    <w:bookmarkEnd w:id="119"/>
-    <w:bookmarkStart w:id="120" w:name="Xcaaec91ffbf8c68a9531b2a24aadbee7afcbbeb"/>
+    <w:bookmarkEnd w:id="121"/>
+    <w:bookmarkStart w:id="122" w:name="Xcaaec91ffbf8c68a9531b2a24aadbee7afcbbeb"/>
     <w:p>
       <w:pPr>
         <w:pStyle w:val="Heading2"/>
@@ -5565,9 +5615,9 @@
         <w:t xml:space="preserve">Revalidar após atualizações de material, alterações de integração, alterações de configuração ou falhas.</w:t>
       </w:r>
     </w:p>
-    <w:bookmarkEnd w:id="120"/>
-    <w:bookmarkEnd w:id="121"/>
-    <w:bookmarkStart w:id="122" w:name="assistente-do-ciso"/>
+    <w:bookmarkEnd w:id="122"/>
+    <w:bookmarkEnd w:id="123"/>
+    <w:bookmarkStart w:id="124" w:name="assistente-do-ciso"/>
     <w:p>
       <w:pPr>
         <w:pStyle w:val="Heading1"/>
@@ -5617,8 +5667,8 @@
         <w:t xml:space="preserve">Crie uma organização fictícia, selecione cinco resultados CSF, atribua proprietários, anexe evidências higienizadas, grave uma lacuna e construa um plano de ação.</w:t>
       </w:r>
     </w:p>
-    <w:bookmarkEnd w:id="122"/>
-    <w:bookmarkStart w:id="123" w:name="evidência-e-limitação"/>
+    <w:bookmarkEnd w:id="124"/>
+    <w:bookmarkStart w:id="125" w:name="evidência-e-limitação"/>
     <w:p>
       <w:pPr>
         <w:pStyle w:val="Heading1"/>
@@ -5635,8 +5685,8 @@
         <w:t xml:space="preserve">Manter autorização, escopo, população alvo, ferramenta e versão de conteúdo, configuração, resultado bruto, revisor, decisão, ação corretiva, exceção e reteste. A ferramenta suporta o trabalho selecionado; não pode certificar o alinhamento CSF, determinar escopo completo, ou substituir julgamento humano qualificado.</w:t>
       </w:r>
     </w:p>
-    <w:bookmarkEnd w:id="123"/>
-    <w:bookmarkStart w:id="125" w:name="wazuh"/>
+    <w:bookmarkEnd w:id="125"/>
+    <w:bookmarkStart w:id="127" w:name="wazuh"/>
     <w:p>
       <w:pPr>
         <w:pStyle w:val="Heading1"/>
@@ -5663,7 +5713,7 @@
       <w:r>
         <w:t xml:space="preserve"> </w:t>
       </w:r>
-      <w:hyperlink r:id="rId124">
+      <w:hyperlink r:id="rId126">
         <w:r>
           <w:rPr>
             <w:rStyle w:val="Hyperlink"/>
@@ -5694,8 +5744,8 @@
         <w:t xml:space="preserve">Conecte um terminal de laboratório autorizado, crie um evento inofensivo, reveja o alerta, documente a decisão e mantenha o evento e o ticket.</w:t>
       </w:r>
     </w:p>
-    <w:bookmarkEnd w:id="125"/>
-    <w:bookmarkStart w:id="126" w:name="evidência-e-limitação-1"/>
+    <w:bookmarkEnd w:id="127"/>
+    <w:bookmarkStart w:id="128" w:name="evidência-e-limitação-1"/>
     <w:p>
       <w:pPr>
         <w:pStyle w:val="Heading1"/>
@@ -5712,8 +5762,8 @@
         <w:t xml:space="preserve">Manter autorização, escopo, população alvo, ferramenta e versão de conteúdo, configuração, resultado bruto, revisor, decisão, ação corretiva, exceção e reteste. A ferramenta suporta o trabalho selecionado; não pode certificar o alinhamento CSF, determinar escopo completo, ou substituir julgamento humano qualificado.</w:t>
       </w:r>
     </w:p>
-    <w:bookmarkEnd w:id="126"/>
-    <w:bookmarkStart w:id="128" w:name="osquery"/>
+    <w:bookmarkEnd w:id="128"/>
+    <w:bookmarkStart w:id="130" w:name="osquery"/>
     <w:p>
       <w:pPr>
         <w:pStyle w:val="Heading1"/>
@@ -5740,7 +5790,7 @@
       <w:r>
         <w:t xml:space="preserve"> </w:t>
       </w:r>
-      <w:hyperlink r:id="rId127">
+      <w:hyperlink r:id="rId129">
         <w:r>
           <w:rPr>
             <w:rStyle w:val="Hyperlink"/>
@@ -5765,8 +5815,8 @@
         <w:t xml:space="preserve">Consultar usuários, software, serviços, criptografia ou processos em um endpoint de laboratório; registrar consulta, host, tempo, saída e revisão.</w:t>
       </w:r>
     </w:p>
-    <w:bookmarkEnd w:id="128"/>
-    <w:bookmarkStart w:id="129" w:name="evidência-e-limitação-2"/>
+    <w:bookmarkEnd w:id="130"/>
+    <w:bookmarkStart w:id="131" w:name="evidência-e-limitação-2"/>
     <w:p>
       <w:pPr>
         <w:pStyle w:val="Heading1"/>
@@ -5783,8 +5833,8 @@
         <w:t xml:space="preserve">Manter autorização, escopo, população alvo, ferramenta e versão de conteúdo, configuração, resultado bruto, revisor, decisão, ação corretiva, exceção e reteste. A ferramenta suporta o trabalho selecionado; não pode certificar o alinhamento CSF, determinar escopo completo, ou substituir julgamento humano qualificado.</w:t>
       </w:r>
     </w:p>
-    <w:bookmarkEnd w:id="129"/>
-    <w:bookmarkStart w:id="131" w:name="openscap"/>
+    <w:bookmarkEnd w:id="131"/>
+    <w:bookmarkStart w:id="133" w:name="openscap"/>
     <w:p>
       <w:pPr>
         <w:pStyle w:val="Heading1"/>
@@ -5811,7 +5861,7 @@
       <w:r>
         <w:t xml:space="preserve"> </w:t>
       </w:r>
-      <w:hyperlink r:id="rId130">
+      <w:hyperlink r:id="rId132">
         <w:r>
           <w:rPr>
             <w:rStyle w:val="Hyperlink"/>
@@ -5836,8 +5886,8 @@
         <w:t xml:space="preserve">Avaliar um laboratório Linux autorizado contra um perfil adequado, corrigir uma configuração aprovada e comparar os relatórios anteriores e posteriores.</w:t>
       </w:r>
     </w:p>
-    <w:bookmarkEnd w:id="131"/>
-    <w:bookmarkStart w:id="132" w:name="evidência-e-limitação-3"/>
+    <w:bookmarkEnd w:id="133"/>
+    <w:bookmarkStart w:id="134" w:name="evidência-e-limitação-3"/>
     <w:p>
       <w:pPr>
         <w:pStyle w:val="Heading1"/>
@@ -5854,8 +5904,8 @@
         <w:t xml:space="preserve">Manter autorização, escopo, população alvo, ferramenta e versão de conteúdo, configuração, resultado bruto, revisor, decisão, ação corretiva, exceção e reteste. A ferramenta suporta o trabalho selecionado; não pode certificar o alinhamento CSF, determinar escopo completo, ou substituir julgamento humano qualificado.</w:t>
       </w:r>
     </w:p>
-    <w:bookmarkEnd w:id="132"/>
-    <w:bookmarkStart w:id="134" w:name="greenbone-community-edition"/>
+    <w:bookmarkEnd w:id="134"/>
+    <w:bookmarkStart w:id="136" w:name="greenbone-community-edition"/>
     <w:p>
       <w:pPr>
         <w:pStyle w:val="Heading1"/>
@@ -5886,7 +5936,7 @@
       <w:r>
         <w:t xml:space="preserve"> </w:t>
       </w:r>
-      <w:hyperlink r:id="rId133">
+      <w:hyperlink r:id="rId135">
         <w:r>
           <w:rPr>
             <w:rStyle w:val="Hyperlink"/>
@@ -5911,8 +5961,8 @@
         <w:t xml:space="preserve">Analisar apenas um alvo de laboratório aprovado, validar um achado, corrigi-lo, rescan, e escopo do documento e limitações.</w:t>
       </w:r>
     </w:p>
-    <w:bookmarkEnd w:id="134"/>
-    <w:bookmarkStart w:id="135" w:name="evidência-e-limitação-4"/>
+    <w:bookmarkEnd w:id="136"/>
+    <w:bookmarkStart w:id="137" w:name="evidência-e-limitação-4"/>
     <w:p>
       <w:pPr>
         <w:pStyle w:val="Heading1"/>
@@ -5929,8 +5979,8 @@
         <w:t xml:space="preserve">Manter autorização, escopo, população alvo, ferramenta e versão de conteúdo, configuração, resultado bruto, revisor, decisão, ação corretiva, exceção e reteste. A ferramenta suporta o trabalho selecionado; não pode certificar o alinhamento CSF, determinar escopo completo, ou substituir julgamento humano qualificado.</w:t>
       </w:r>
     </w:p>
-    <w:bookmarkEnd w:id="135"/>
-    <w:bookmarkStart w:id="137" w:name="trivy"/>
+    <w:bookmarkEnd w:id="137"/>
+    <w:bookmarkStart w:id="139" w:name="trivy"/>
     <w:p>
       <w:pPr>
         <w:pStyle w:val="Heading1"/>
@@ -5957,7 +6007,7 @@
       <w:r>
         <w:t xml:space="preserve"> </w:t>
       </w:r>
-      <w:hyperlink r:id="rId136">
+      <w:hyperlink r:id="rId138">
         <w:r>
           <w:rPr>
             <w:rStyle w:val="Hyperlink"/>
@@ -5988,8 +6038,8 @@
         <w:t xml:space="preserve">Examine uma imagem de laboratório ou repositório de testes, proteja o relatório, valide um resultado, corrija-o e verifique novamente.</w:t>
       </w:r>
     </w:p>
-    <w:bookmarkEnd w:id="137"/>
-    <w:bookmarkStart w:id="138" w:name="evidência-e-limitação-5"/>
+    <w:bookmarkEnd w:id="139"/>
+    <w:bookmarkStart w:id="140" w:name="evidência-e-limitação-5"/>
     <w:p>
       <w:pPr>
         <w:pStyle w:val="Heading1"/>
@@ -6006,8 +6056,8 @@
         <w:t xml:space="preserve">Manter autorização, escopo, população alvo, ferramenta e versão de conteúdo, configuração, resultado bruto, revisor, decisão, ação corretiva, exceção e reteste. A ferramenta suporta o trabalho selecionado; não pode certificar o alinhamento CSF, determinar escopo completo, ou substituir julgamento humano qualificado.</w:t>
       </w:r>
     </w:p>
-    <w:bookmarkEnd w:id="138"/>
-    <w:bookmarkStart w:id="140" w:name="owasp-zap"/>
+    <w:bookmarkEnd w:id="140"/>
+    <w:bookmarkStart w:id="142" w:name="owasp-zap"/>
     <w:p>
       <w:pPr>
         <w:pStyle w:val="Heading1"/>
@@ -6034,7 +6084,7 @@
       <w:r>
         <w:t xml:space="preserve"> </w:t>
       </w:r>
-      <w:hyperlink r:id="rId139">
+      <w:hyperlink r:id="rId141">
         <w:r>
           <w:rPr>
             <w:rStyle w:val="Hyperlink"/>
@@ -6065,8 +6115,8 @@
         <w:t xml:space="preserve">Proxy uma aplicação de treinamento local, começar com análise passiva, validar um achado, e manter o escopo e resultados aprovados.</w:t>
       </w:r>
     </w:p>
-    <w:bookmarkEnd w:id="140"/>
-    <w:bookmarkStart w:id="141" w:name="evidência-e-limitação-6"/>
+    <w:bookmarkEnd w:id="142"/>
+    <w:bookmarkStart w:id="143" w:name="evidência-e-limitação-6"/>
     <w:p>
       <w:pPr>
         <w:pStyle w:val="Heading1"/>
@@ -6083,8 +6133,8 @@
         <w:t xml:space="preserve">Manter autorização, escopo, população alvo, ferramenta e versão de conteúdo, configuração, resultado bruto, revisor, decisão, ação corretiva, exceção e reteste. A ferramenta suporta o trabalho selecionado; não pode certificar o alinhamento CSF, determinar escopo completo, ou substituir julgamento humano qualificado.</w:t>
       </w:r>
     </w:p>
-    <w:bookmarkEnd w:id="141"/>
-    <w:bookmarkStart w:id="143" w:name="keycloak"/>
+    <w:bookmarkEnd w:id="143"/>
+    <w:bookmarkStart w:id="145" w:name="keycloak"/>
     <w:p>
       <w:pPr>
         <w:pStyle w:val="Heading1"/>
@@ -6111,7 +6161,7 @@
       <w:r>
         <w:t xml:space="preserve"> </w:t>
       </w:r>
-      <w:hyperlink r:id="rId142">
+      <w:hyperlink r:id="rId144">
         <w:r>
           <w:rPr>
             <w:rStyle w:val="Hyperlink"/>
@@ -6136,8 +6186,8 @@
         <w:t xml:space="preserve">Crie um reino de laboratório, usuários, papéis e MFA; teste menos privilégio, acesso falhado e remoção; exporte evidências de configuração higienizadas.</w:t>
       </w:r>
     </w:p>
-    <w:bookmarkEnd w:id="143"/>
-    <w:bookmarkStart w:id="144" w:name="evidência-e-limitação-7"/>
+    <w:bookmarkEnd w:id="145"/>
+    <w:bookmarkStart w:id="146" w:name="evidência-e-limitação-7"/>
     <w:p>
       <w:pPr>
         <w:pStyle w:val="Heading1"/>
@@ -6154,8 +6204,8 @@
         <w:t xml:space="preserve">Manter autorização, escopo, população alvo, ferramenta e versão de conteúdo, configuração, resultado bruto, revisor, decisão, ação corretiva, exceção e reteste. A ferramenta suporta o trabalho selecionado; não pode certificar o alinhamento CSF, determinar escopo completo, ou substituir julgamento humano qualificado.</w:t>
       </w:r>
     </w:p>
-    <w:bookmarkEnd w:id="144"/>
-    <w:bookmarkStart w:id="146" w:name="defectdojo"/>
+    <w:bookmarkEnd w:id="146"/>
+    <w:bookmarkStart w:id="148" w:name="defectdojo"/>
     <w:p>
       <w:pPr>
         <w:pStyle w:val="Heading1"/>
@@ -6186,7 +6236,7 @@
       <w:r>
         <w:t xml:space="preserve"> </w:t>
       </w:r>
-      <w:hyperlink r:id="rId145">
+      <w:hyperlink r:id="rId147">
         <w:r>
           <w:rPr>
             <w:rStyle w:val="Hyperlink"/>
@@ -6211,8 +6261,8 @@
         <w:t xml:space="preserve">Importar um relatório de laboratório, validar e atribuir um achado, correção de registro, reteste-o, e fechá-lo com prova.</w:t>
       </w:r>
     </w:p>
-    <w:bookmarkEnd w:id="146"/>
-    <w:bookmarkStart w:id="147" w:name="evidência-e-limitação-8"/>
+    <w:bookmarkEnd w:id="148"/>
+    <w:bookmarkStart w:id="149" w:name="evidência-e-limitação-8"/>
     <w:p>
       <w:pPr>
         <w:pStyle w:val="Heading1"/>
@@ -6229,8 +6279,8 @@
         <w:t xml:space="preserve">Manter autorização, escopo, população alvo, ferramenta e versão de conteúdo, configuração, resultado bruto, revisor, decisão, ação corretiva, exceção e reteste. A ferramenta suporta o trabalho selecionado; não pode certificar o alinhamento CSF, determinar escopo completo, ou substituir julgamento humano qualificado.</w:t>
       </w:r>
     </w:p>
-    <w:bookmarkEnd w:id="147"/>
-    <w:bookmarkStart w:id="149" w:name="velociraptor"/>
+    <w:bookmarkEnd w:id="149"/>
+    <w:bookmarkStart w:id="151" w:name="velociraptor"/>
     <w:p>
       <w:pPr>
         <w:pStyle w:val="Heading1"/>
@@ -6257,7 +6307,7 @@
       <w:r>
         <w:t xml:space="preserve"> </w:t>
       </w:r>
-      <w:hyperlink r:id="rId148">
+      <w:hyperlink r:id="rId150">
         <w:r>
           <w:rPr>
             <w:rStyle w:val="Hyperlink"/>
@@ -6282,8 +6332,8 @@
         <w:t xml:space="preserve">Use um cliente de laboratório isolado, colete um artefato aprovado inofensivo, e finalidade de registro, escopo, coleta, revisão e preservação.</w:t>
       </w:r>
     </w:p>
-    <w:bookmarkEnd w:id="149"/>
-    <w:bookmarkStart w:id="150" w:name="evidência-e-limitação-9"/>
+    <w:bookmarkEnd w:id="151"/>
+    <w:bookmarkStart w:id="152" w:name="evidência-e-limitação-9"/>
     <w:p>
       <w:pPr>
         <w:pStyle w:val="Heading1"/>
@@ -6300,8 +6350,8 @@
         <w:t xml:space="preserve">Manter autorização, escopo, população alvo, ferramenta e versão de conteúdo, configuração, resultado bruto, revisor, decisão, ação corretiva, exceção e reteste. A ferramenta suporta o trabalho selecionado; não pode certificar o alinhamento CSF, determinar escopo completo, ou substituir julgamento humano qualificado.</w:t>
       </w:r>
     </w:p>
-    <w:bookmarkEnd w:id="150"/>
-    <w:bookmarkStart w:id="152" w:name="open-policy-agent"/>
+    <w:bookmarkEnd w:id="152"/>
+    <w:bookmarkStart w:id="154" w:name="open-policy-agent"/>
     <w:p>
       <w:pPr>
         <w:pStyle w:val="Heading1"/>
@@ -6332,7 +6382,7 @@
       <w:r>
         <w:t xml:space="preserve"> </w:t>
       </w:r>
-      <w:hyperlink r:id="rId151">
+      <w:hyperlink r:id="rId153">
         <w:r>
           <w:rPr>
             <w:rStyle w:val="Hyperlink"/>
@@ -6357,8 +6407,8 @@
         <w:t xml:space="preserve">Escreva uma regra de laboratório que exija um proprietário, classificação e ambiente aprovado; teste de entradas permitidas e negadas.</w:t>
       </w:r>
     </w:p>
-    <w:bookmarkEnd w:id="152"/>
-    <w:bookmarkStart w:id="153" w:name="evidência-e-limitação-10"/>
+    <w:bookmarkEnd w:id="154"/>
+    <w:bookmarkStart w:id="155" w:name="evidência-e-limitação-10"/>
     <w:p>
       <w:pPr>
         <w:pStyle w:val="Heading1"/>
@@ -6375,8 +6425,8 @@
         <w:t xml:space="preserve">Manter autorização, escopo, população alvo, ferramenta e versão de conteúdo, configuração, resultado bruto, revisor, decisão, ação corretiva, exceção e reteste. A ferramenta suporta o trabalho selecionado; não pode certificar o alinhamento CSF, determinar escopo completo, ou substituir julgamento humano qualificado.</w:t>
       </w:r>
     </w:p>
-    <w:bookmarkEnd w:id="153"/>
-    <w:bookmarkStart w:id="155" w:name="opensearch"/>
+    <w:bookmarkEnd w:id="155"/>
+    <w:bookmarkStart w:id="157" w:name="opensearch"/>
     <w:p>
       <w:pPr>
         <w:pStyle w:val="Heading1"/>
@@ -6403,7 +6453,7 @@
       <w:r>
         <w:t xml:space="preserve"> </w:t>
       </w:r>
-      <w:hyperlink r:id="rId154">
+      <w:hyperlink r:id="rId156">
         <w:r>
           <w:rPr>
             <w:rStyle w:val="Hyperlink"/>
@@ -6428,8 +6478,8 @@
         <w:t xml:space="preserve">Carregar eventos de segurança sintéticos, construir uma pesquisa e painel, cobertura de dados de documentos, acesso, retenção, revisão e limitações.</w:t>
       </w:r>
     </w:p>
-    <w:bookmarkEnd w:id="155"/>
-    <w:bookmarkStart w:id="156" w:name="evidência-e-limitação-11"/>
+    <w:bookmarkEnd w:id="157"/>
+    <w:bookmarkStart w:id="158" w:name="evidência-e-limitação-11"/>
     <w:p>
       <w:pPr>
         <w:pStyle w:val="Heading1"/>
@@ -6446,8 +6496,8 @@
         <w:t xml:space="preserve">Manter autorização, escopo, população alvo, ferramenta e versão de conteúdo, configuração, resultado bruto, revisor, decisão, ação corretiva, exceção e reteste. A ferramenta suporta o trabalho selecionado; não pode certificar o alinhamento CSF, determinar escopo completo, ou substituir julgamento humano qualificado.</w:t>
       </w:r>
     </w:p>
-    <w:bookmarkEnd w:id="156"/>
-    <w:bookmarkStart w:id="159" w:name="ferramentas-oficiais-nist"/>
+    <w:bookmarkEnd w:id="158"/>
+    <w:bookmarkStart w:id="161" w:name="ferramentas-oficiais-nist"/>
     <w:p>
       <w:pPr>
         <w:pStyle w:val="Heading1"/>
@@ -6466,7 +6516,7 @@
       <w:r>
         <w:t xml:space="preserve"> </w:t>
       </w:r>
-      <w:hyperlink r:id="rId157">
+      <w:hyperlink r:id="rId159">
         <w:r>
           <w:rPr>
             <w:rStyle w:val="Hyperlink"/>
@@ -6489,7 +6539,7 @@
       <w:r>
         <w:t xml:space="preserve"> </w:t>
       </w:r>
-      <w:hyperlink r:id="rId158">
+      <w:hyperlink r:id="rId160">
         <w:r>
           <w:rPr>
             <w:rStyle w:val="Hyperlink"/>
@@ -6498,8 +6548,8 @@
         </w:r>
       </w:hyperlink>
     </w:p>
-    <w:bookmarkEnd w:id="159"/>
-    <w:bookmarkStart w:id="160" w:name="csf-do-gerente-playbook"/>
+    <w:bookmarkEnd w:id="161"/>
+    <w:bookmarkStart w:id="162" w:name="csf-do-gerente-playbook"/>
     <w:p>
       <w:pPr>
         <w:pStyle w:val="Heading1"/>
@@ -6520,8 +6570,8 @@
         <w:t xml:space="preserve">Perguntas, rotinas de governança, painéis e gestores de decisões devem controlar.</w:t>
       </w:r>
     </w:p>
-    <w:bookmarkEnd w:id="160"/>
-    <w:bookmarkStart w:id="161" w:name="perguntas-mensais"/>
+    <w:bookmarkEnd w:id="162"/>
+    <w:bookmarkStart w:id="163" w:name="perguntas-mensais"/>
     <w:p>
       <w:pPr>
         <w:pStyle w:val="Heading1"/>
@@ -6615,8 +6665,8 @@
         <w:t xml:space="preserve">Quais as limitações que a liderança deve entender antes de confiar no painel?</w:t>
       </w:r>
     </w:p>
-    <w:bookmarkEnd w:id="161"/>
-    <w:bookmarkStart w:id="163" w:name="painel"/>
+    <w:bookmarkEnd w:id="163"/>
+    <w:bookmarkStart w:id="165" w:name="painel"/>
     <w:p>
       <w:pPr>
         <w:pStyle w:val="Heading1"/>
@@ -6625,7 +6675,7 @@
         <w:t xml:space="preserve"># 17.2 Painel</w:t>
       </w:r>
     </w:p>
-    <w:bookmarkStart w:id="162" w:name="section-2"/>
+    <w:bookmarkStart w:id="164" w:name="section-2"/>
     <w:p>
       <w:pPr>
         <w:pStyle w:val="Heading2"/>
@@ -6690,9 +6740,9 @@
         <w:t xml:space="preserve">□ Melhoria □ Os resultados são corrigidos e testados de forma independente? Verde / Amarelo / Vermelho</w:t>
       </w:r>
     </w:p>
-    <w:bookmarkEnd w:id="162"/>
-    <w:bookmarkEnd w:id="163"/>
-    <w:bookmarkStart w:id="164" w:name="erros-comuns"/>
+    <w:bookmarkEnd w:id="164"/>
+    <w:bookmarkEnd w:id="165"/>
+    <w:bookmarkStart w:id="166" w:name="erros-comuns"/>
     <w:p>
       <w:pPr>
         <w:pStyle w:val="Heading1"/>
@@ -6800,8 +6850,8 @@
         <w:t xml:space="preserve">Descrevendo o alinhamento CSF como conformidade legal ou certificação NIST.</w:t>
       </w:r>
     </w:p>
-    <w:bookmarkEnd w:id="164"/>
-    <w:bookmarkStart w:id="165" w:name="de-iniciante-a-analista-júnior"/>
+    <w:bookmarkEnd w:id="166"/>
+    <w:bookmarkStart w:id="169" w:name="de-iniciante-a-analista-júnior"/>
     <w:p>
       <w:pPr>
         <w:pStyle w:val="Heading1"/>
@@ -6824,208 +6874,258 @@
     </w:p>
     <w:p>
       <w:pPr>
+        <w:pStyle w:val="CaptionedFigure"/>
+      </w:pPr>
+      <w:r>
+        <w:drawing>
+          <wp:inline>
+            <wp:extent cx="5334000" cy="2963333"/>
+            <wp:effectExtent b="0" l="0" r="0" t="0"/>
+            <wp:docPr descr="Learn, map, test, report, and apply with honest portfolio evidence." title="" id="167" name="Picture"/>
+            <a:graphic>
+              <a:graphicData uri="http://schemas.openxmlformats.org/drawingml/2006/picture">
+                <pic:pic>
+                  <pic:nvPicPr>
+                    <pic:cNvPr descr="media/image2_pt-BR.png" id="168" name="Picture"/>
+                    <pic:cNvPicPr>
+                      <a:picLocks noChangeArrowheads="1" noChangeAspect="1"/>
+                    </pic:cNvPicPr>
+                  </pic:nvPicPr>
+                  <pic:blipFill>
+                    <a:blip r:embed="rId31"/>
+                    <a:stretch>
+                      <a:fillRect/>
+                    </a:stretch>
+                  </pic:blipFill>
+                  <pic:spPr bwMode="auto">
+                    <a:xfrm>
+                      <a:off x="0" y="0"/>
+                      <a:ext cx="5334000" cy="2963333"/>
+                    </a:xfrm>
+                    <a:prstGeom prst="rect">
+                      <a:avLst/>
+                    </a:prstGeom>
+                    <a:noFill/>
+                    <a:ln w="9525">
+                      <a:noFill/>
+                      <a:headEnd/>
+                      <a:tailEnd/>
+                    </a:ln>
+                  </pic:spPr>
+                </pic:pic>
+              </a:graphicData>
+            </a:graphic>
+          </wp:inline>
+        </w:drawing>
+      </w:r>
+    </w:p>
+    <w:p>
+      <w:pPr>
+        <w:pStyle w:val="ImageCaption"/>
+      </w:pPr>
+      <w:r>
+        <w:t xml:space="preserve">Learn, map, test, report, and apply with honest portfolio evidence.</w:t>
+      </w:r>
+    </w:p>
+    <w:p>
+      <w:pPr>
+        <w:pStyle w:val="BodyText"/>
+      </w:pPr>
+      <w:r>
+        <w:t xml:space="preserve">Figura 8. Caminho do analista júnior</w:t>
+      </w:r>
+    </w:p>
+    <w:bookmarkEnd w:id="169"/>
+    <w:bookmarkStart w:id="170" w:name="funções-de-nível-de-entrada"/>
+    <w:p>
+      <w:pPr>
+        <w:pStyle w:val="Heading1"/>
+      </w:pPr>
+      <w:r>
+        <w:t xml:space="preserve"># 18.1 Funções de nível de entrada</w:t>
+      </w:r>
+    </w:p>
+    <w:p>
+      <w:pPr>
         <w:pStyle w:val="FirstParagraph"/>
       </w:pPr>
-    </w:p>
-    <w:p>
-      <w:pPr>
-        <w:pStyle w:val="BodyText"/>
-      </w:pPr>
-      <w:r>
-        <w:t xml:space="preserve">Figura 8. Caminho do analista júnior</w:t>
-      </w:r>
-    </w:p>
-    <w:bookmarkEnd w:id="165"/>
-    <w:bookmarkStart w:id="166" w:name="funções-de-nível-de-entrada"/>
+      <w:r>
+        <w:t xml:space="preserve">GRC Júnior Analisador</w:t>
+      </w:r>
+    </w:p>
+    <w:p>
+      <w:pPr>
+        <w:pStyle w:val="BodyText"/>
+      </w:pPr>
+      <w:r>
+        <w:t xml:space="preserve">Analista de Risco de Cibersegurança</w:t>
+      </w:r>
+    </w:p>
+    <w:p>
+      <w:pPr>
+        <w:pStyle w:val="BodyText"/>
+      </w:pPr>
+      <w:r>
+        <w:t xml:space="preserve">Analisador de conformidade</w:t>
+      </w:r>
+    </w:p>
+    <w:p>
+      <w:pPr>
+        <w:pStyle w:val="BodyText"/>
+      </w:pPr>
+      <w:r>
+        <w:t xml:space="preserve">Analista de Controles de Segurança</w:t>
+      </w:r>
+    </w:p>
+    <w:p>
+      <w:pPr>
+        <w:pStyle w:val="BodyText"/>
+      </w:pPr>
+      <w:r>
+        <w:t xml:space="preserve">Analista de Riscos de Terceiros</w:t>
+      </w:r>
+    </w:p>
+    <w:p>
+      <w:pPr>
+        <w:pStyle w:val="BodyText"/>
+      </w:pPr>
+      <w:r>
+        <w:t xml:space="preserve">Analista de Garantia de Segurança</w:t>
+      </w:r>
+    </w:p>
+    <w:p>
+      <w:pPr>
+        <w:pStyle w:val="BodyText"/>
+      </w:pPr>
+      <w:r>
+        <w:t xml:space="preserve">Analista do Programa de Cibersegurança</w:t>
+      </w:r>
+    </w:p>
+    <w:p>
+      <w:pPr>
+        <w:pStyle w:val="BodyText"/>
+      </w:pPr>
+      <w:r>
+        <w:t xml:space="preserve">Analista de Segurança Júnior</w:t>
+      </w:r>
+    </w:p>
+    <w:p>
+      <w:pPr>
+        <w:pStyle w:val="BodyText"/>
+      </w:pPr>
+      <w:r>
+        <w:t xml:space="preserve">Analisador de Prontos de Auditoria</w:t>
+      </w:r>
+    </w:p>
+    <w:bookmarkEnd w:id="170"/>
+    <w:bookmarkStart w:id="171" w:name="X1083fd6e433c69cb117e0a783d0eaf23b9c048e"/>
     <w:p>
       <w:pPr>
         <w:pStyle w:val="Heading1"/>
       </w:pPr>
       <w:r>
-        <w:t xml:space="preserve"># 18.1 Funções de nível de entrada</w:t>
-      </w:r>
-    </w:p>
-    <w:p>
-      <w:pPr>
-        <w:pStyle w:val="FirstParagraph"/>
-      </w:pPr>
-      <w:r>
-        <w:t xml:space="preserve">GRC Júnior Analisador</w:t>
-      </w:r>
-    </w:p>
-    <w:p>
-      <w:pPr>
-        <w:pStyle w:val="BodyText"/>
-      </w:pPr>
-      <w:r>
-        <w:t xml:space="preserve">Analista de Risco de Cibersegurança</w:t>
-      </w:r>
-    </w:p>
-    <w:p>
-      <w:pPr>
-        <w:pStyle w:val="BodyText"/>
-      </w:pPr>
-      <w:r>
-        <w:t xml:space="preserve">Analisador de conformidade</w:t>
-      </w:r>
-    </w:p>
-    <w:p>
-      <w:pPr>
-        <w:pStyle w:val="BodyText"/>
-      </w:pPr>
-      <w:r>
-        <w:t xml:space="preserve">Analista de Controles de Segurança</w:t>
-      </w:r>
-    </w:p>
-    <w:p>
-      <w:pPr>
-        <w:pStyle w:val="BodyText"/>
-      </w:pPr>
-      <w:r>
-        <w:t xml:space="preserve">Analista de Riscos de Terceiros</w:t>
-      </w:r>
-    </w:p>
-    <w:p>
-      <w:pPr>
-        <w:pStyle w:val="BodyText"/>
-      </w:pPr>
-      <w:r>
-        <w:t xml:space="preserve">Analista de Garantia de Segurança</w:t>
-      </w:r>
-    </w:p>
-    <w:p>
-      <w:pPr>
-        <w:pStyle w:val="BodyText"/>
-      </w:pPr>
-      <w:r>
-        <w:t xml:space="preserve">Analista do Programa de Cibersegurança</w:t>
-      </w:r>
-    </w:p>
-    <w:p>
-      <w:pPr>
-        <w:pStyle w:val="BodyText"/>
-      </w:pPr>
-      <w:r>
-        <w:t xml:space="preserve">Analista de Segurança Júnior</w:t>
-      </w:r>
-    </w:p>
-    <w:p>
-      <w:pPr>
-        <w:pStyle w:val="BodyText"/>
-      </w:pPr>
-      <w:r>
-        <w:t xml:space="preserve">Analisador de Prontos de Auditoria</w:t>
-      </w:r>
-    </w:p>
-    <w:bookmarkEnd w:id="166"/>
-    <w:bookmarkStart w:id="167" w:name="X1083fd6e433c69cb117e0a783d0eaf23b9c048e"/>
+        <w:t xml:space="preserve"># 18.2 Trabalho que um analista júnior pode executar</w:t>
+      </w:r>
+    </w:p>
+    <w:p>
+      <w:pPr>
+        <w:numPr>
+          <w:ilvl w:val="0"/>
+          <w:numId w:val="1033"/>
+        </w:numPr>
+      </w:pPr>
+      <w:r>
+        <w:t xml:space="preserve">Manter ativos, dados, sistema, risco, obrigação, fornecedor e inventários de evidências.</w:t>
+      </w:r>
+    </w:p>
+    <w:p>
+      <w:pPr>
+        <w:numPr>
+          <w:ilvl w:val="0"/>
+          <w:numId w:val="1033"/>
+        </w:numPr>
+      </w:pPr>
+      <w:r>
+        <w:t xml:space="preserve">Recolha e organize provas para resultados CSF.</w:t>
+      </w:r>
+    </w:p>
+    <w:p>
+      <w:pPr>
+        <w:numPr>
+          <w:ilvl w:val="0"/>
+          <w:numId w:val="1033"/>
+        </w:numPr>
+      </w:pPr>
+      <w:r>
+        <w:t xml:space="preserve">Revise acesso, vulnerabilidade, treinamento, registro, backup, fornecedor e amostras de incidentes.</w:t>
+      </w:r>
+    </w:p>
+    <w:p>
+      <w:pPr>
+        <w:numPr>
+          <w:ilvl w:val="0"/>
+          <w:numId w:val="1033"/>
+        </w:numPr>
+      </w:pPr>
+      <w:r>
+        <w:t xml:space="preserve">Status do Perfil do Documento, lacunas, limitações, proprietários e planos de ação.</w:t>
+      </w:r>
+    </w:p>
+    <w:p>
+      <w:pPr>
+        <w:numPr>
+          <w:ilvl w:val="0"/>
+          <w:numId w:val="1033"/>
+        </w:numPr>
+      </w:pPr>
+      <w:r>
+        <w:t xml:space="preserve">Rastreie ações corretivas, exceções, aceitação de riscos e retestes.</w:t>
+      </w:r>
+    </w:p>
+    <w:p>
+      <w:pPr>
+        <w:numPr>
+          <w:ilvl w:val="0"/>
+          <w:numId w:val="1033"/>
+        </w:numPr>
+      </w:pPr>
+      <w:r>
+        <w:t xml:space="preserve">Preparar painéis claros e materiais de reunião sem esconder incerteza.</w:t>
+      </w:r>
+    </w:p>
+    <w:p>
+      <w:pPr>
+        <w:numPr>
+          <w:ilvl w:val="0"/>
+          <w:numId w:val="1033"/>
+        </w:numPr>
+      </w:pPr>
+      <w:r>
+        <w:t xml:space="preserve">Exercícios de suporte, cronogramas de incidentes, lições aprendidas e atualizações de planejamento.</w:t>
+      </w:r>
+    </w:p>
+    <w:p>
+      <w:pPr>
+        <w:numPr>
+          <w:ilvl w:val="0"/>
+          <w:numId w:val="1033"/>
+        </w:numPr>
+      </w:pPr>
+      <w:r>
+        <w:t xml:space="preserve">Proteger informações confidenciais e seguir limites de autorização.</w:t>
+      </w:r>
+    </w:p>
+    <w:bookmarkEnd w:id="171"/>
+    <w:bookmarkStart w:id="173" w:name="prova-de-carteira"/>
     <w:p>
       <w:pPr>
         <w:pStyle w:val="Heading1"/>
       </w:pPr>
       <w:r>
-        <w:t xml:space="preserve"># 18.2 Trabalho que um analista júnior pode executar</w:t>
-      </w:r>
-    </w:p>
-    <w:p>
-      <w:pPr>
-        <w:numPr>
-          <w:ilvl w:val="0"/>
-          <w:numId w:val="1033"/>
-        </w:numPr>
-      </w:pPr>
-      <w:r>
-        <w:t xml:space="preserve">Manter ativos, dados, sistema, risco, obrigação, fornecedor e inventários de evidências.</w:t>
-      </w:r>
-    </w:p>
-    <w:p>
-      <w:pPr>
-        <w:numPr>
-          <w:ilvl w:val="0"/>
-          <w:numId w:val="1033"/>
-        </w:numPr>
-      </w:pPr>
-      <w:r>
-        <w:t xml:space="preserve">Recolha e organize provas para resultados CSF.</w:t>
-      </w:r>
-    </w:p>
-    <w:p>
-      <w:pPr>
-        <w:numPr>
-          <w:ilvl w:val="0"/>
-          <w:numId w:val="1033"/>
-        </w:numPr>
-      </w:pPr>
-      <w:r>
-        <w:t xml:space="preserve">Revise acesso, vulnerabilidade, treinamento, registro, backup, fornecedor e amostras de incidentes.</w:t>
-      </w:r>
-    </w:p>
-    <w:p>
-      <w:pPr>
-        <w:numPr>
-          <w:ilvl w:val="0"/>
-          <w:numId w:val="1033"/>
-        </w:numPr>
-      </w:pPr>
-      <w:r>
-        <w:t xml:space="preserve">Status do Perfil do Documento, lacunas, limitações, proprietários e planos de ação.</w:t>
-      </w:r>
-    </w:p>
-    <w:p>
-      <w:pPr>
-        <w:numPr>
-          <w:ilvl w:val="0"/>
-          <w:numId w:val="1033"/>
-        </w:numPr>
-      </w:pPr>
-      <w:r>
-        <w:t xml:space="preserve">Rastreie ações corretivas, exceções, aceitação de riscos e retestes.</w:t>
-      </w:r>
-    </w:p>
-    <w:p>
-      <w:pPr>
-        <w:numPr>
-          <w:ilvl w:val="0"/>
-          <w:numId w:val="1033"/>
-        </w:numPr>
-      </w:pPr>
-      <w:r>
-        <w:t xml:space="preserve">Preparar painéis claros e materiais de reunião sem esconder incerteza.</w:t>
-      </w:r>
-    </w:p>
-    <w:p>
-      <w:pPr>
-        <w:numPr>
-          <w:ilvl w:val="0"/>
-          <w:numId w:val="1033"/>
-        </w:numPr>
-      </w:pPr>
-      <w:r>
-        <w:t xml:space="preserve">Exercícios de suporte, cronogramas de incidentes, lições aprendidas e atualizações de planejamento.</w:t>
-      </w:r>
-    </w:p>
-    <w:p>
-      <w:pPr>
-        <w:numPr>
-          <w:ilvl w:val="0"/>
-          <w:numId w:val="1033"/>
-        </w:numPr>
-      </w:pPr>
-      <w:r>
-        <w:t xml:space="preserve">Proteger informações confidenciais e seguir limites de autorização.</w:t>
-      </w:r>
-    </w:p>
-    <w:bookmarkEnd w:id="167"/>
-    <w:bookmarkStart w:id="169" w:name="prova-de-carteira"/>
-    <w:p>
-      <w:pPr>
-        <w:pStyle w:val="Heading1"/>
-      </w:pPr>
-      <w:r>
         <w:t xml:space="preserve"># 18.3 Prova de carteira</w:t>
       </w:r>
     </w:p>
-    <w:bookmarkStart w:id="168" w:name="habilidade-item-de-carteira"/>
+    <w:bookmarkStart w:id="172" w:name="habilidade-item-de-carteira"/>
     <w:p>
       <w:pPr>
         <w:pStyle w:val="Heading2"/>
@@ -7100,9 +7200,9 @@
         <w:t xml:space="preserve">• Comunicação de gestão – Painel de uma página e declaração de risco executivo</w:t>
       </w:r>
     </w:p>
-    <w:bookmarkEnd w:id="168"/>
-    <w:bookmarkEnd w:id="169"/>
-    <w:bookmarkStart w:id="170" w:name="laboratório-fictício-e-portfólio"/>
+    <w:bookmarkEnd w:id="172"/>
+    <w:bookmarkEnd w:id="173"/>
+    <w:bookmarkStart w:id="174" w:name="laboratório-fictício-e-portfólio"/>
     <w:p>
       <w:pPr>
         <w:pStyle w:val="Heading1"/>
@@ -7131,8 +7231,8 @@
         <w:t xml:space="preserve">Harbor Light Services é uma organização fictícia que fornece um portal de clientes, call center, colaboração em nuvem, integração de pagamentos, força de trabalho remota e análise hospedada por fornecedores. Cada pessoa, conta, endereço, ativo, evento, registro de cliente e fornecedor é inventado.</w:t>
       </w:r>
     </w:p>
-    <w:bookmarkEnd w:id="170"/>
-    <w:bookmarkStart w:id="171" w:name="projeto-1-âmbito-e-contexto"/>
+    <w:bookmarkEnd w:id="174"/>
+    <w:bookmarkStart w:id="175" w:name="projeto-1-âmbito-e-contexto"/>
     <w:p>
       <w:pPr>
         <w:pStyle w:val="Heading1"/>
@@ -7149,8 +7249,8 @@
         <w:t xml:space="preserve">Defina missão, stakeholders, obrigações, serviços críticos, dependências, exclusões e proprietários.</w:t>
       </w:r>
     </w:p>
-    <w:bookmarkEnd w:id="171"/>
-    <w:bookmarkStart w:id="172" w:name="projeto-2-ativos-e-mapas-de-dados"/>
+    <w:bookmarkEnd w:id="175"/>
+    <w:bookmarkStart w:id="176" w:name="projeto-2-ativos-e-mapas-de-dados"/>
     <w:p>
       <w:pPr>
         <w:pStyle w:val="Heading1"/>
@@ -7167,8 +7267,8 @@
         <w:t xml:space="preserve">Construir inventários e um diagrama de fluxo de dados autorizado.</w:t>
       </w:r>
     </w:p>
-    <w:bookmarkEnd w:id="172"/>
-    <w:bookmarkStart w:id="173" w:name="projeto-3-risco"/>
+    <w:bookmarkEnd w:id="176"/>
+    <w:bookmarkStart w:id="177" w:name="projeto-3-risco"/>
     <w:p>
       <w:pPr>
         <w:pStyle w:val="Heading1"/>
@@ -7185,8 +7285,8 @@
         <w:t xml:space="preserve">Crie uma ameaça, vulnerabilidade, probabilidade, impacto, tratamento e registro de risco residual.</w:t>
       </w:r>
     </w:p>
-    <w:bookmarkEnd w:id="173"/>
-    <w:bookmarkStart w:id="174" w:name="projeto-4-perfis"/>
+    <w:bookmarkEnd w:id="177"/>
+    <w:bookmarkStart w:id="178" w:name="projeto-4-perfis"/>
     <w:p>
       <w:pPr>
         <w:pStyle w:val="Heading1"/>
@@ -7203,8 +7303,8 @@
         <w:t xml:space="preserve">Crie perfis de alvo atuais e baseados em risco baseados em evidências.</w:t>
       </w:r>
     </w:p>
-    <w:bookmarkEnd w:id="174"/>
-    <w:bookmarkStart w:id="175" w:name="projeto-5---controles-e-testes"/>
+    <w:bookmarkEnd w:id="178"/>
+    <w:bookmarkStart w:id="179" w:name="projeto-5---controles-e-testes"/>
     <w:p>
       <w:pPr>
         <w:pStyle w:val="Heading1"/>
@@ -7221,8 +7321,8 @@
         <w:t xml:space="preserve">Projete e execute testes fictícios para acesso, vulnerabilidades, logs, backups e fornecedores.</w:t>
       </w:r>
     </w:p>
-    <w:bookmarkEnd w:id="175"/>
-    <w:bookmarkStart w:id="176" w:name="projeto-6-incidente"/>
+    <w:bookmarkEnd w:id="179"/>
+    <w:bookmarkStart w:id="180" w:name="projeto-6-incidente"/>
     <w:p>
       <w:pPr>
         <w:pStyle w:val="Heading1"/>
@@ -7239,8 +7339,8 @@
         <w:t xml:space="preserve">Analisar eventos sintéticos, declarar um incidente, preservar evidências, conter, erradicar, restaurar e aprender.</w:t>
       </w:r>
     </w:p>
-    <w:bookmarkEnd w:id="176"/>
-    <w:bookmarkStart w:id="177" w:name="projeto-7-ferramentas"/>
+    <w:bookmarkEnd w:id="180"/>
+    <w:bookmarkStart w:id="181" w:name="projeto-7-ferramentas"/>
     <w:p>
       <w:pPr>
         <w:pStyle w:val="Heading1"/>
@@ -7257,8 +7357,8 @@
         <w:t xml:space="preserve">Use três ferramentas do Capítulo 16 em um laboratório isolado e registro de autorização, versão, escopo, achados, correção e reteste.</w:t>
       </w:r>
     </w:p>
-    <w:bookmarkEnd w:id="177"/>
-    <w:bookmarkStart w:id="178" w:name="projeto-8-relatório-executivo"/>
+    <w:bookmarkEnd w:id="181"/>
+    <w:bookmarkStart w:id="182" w:name="projeto-8-relatório-executivo"/>
     <w:p>
       <w:pPr>
         <w:pStyle w:val="Heading1"/>
@@ -7289,8 +7389,8 @@
         <w:t xml:space="preserve">□—————————————————————————————————————————————————————————————————————————————————————————————————————–</w:t>
       </w:r>
     </w:p>
-    <w:bookmarkEnd w:id="178"/>
-    <w:bookmarkStart w:id="180" w:name="plano-de-aprendizagem-de-trinta-dias"/>
+    <w:bookmarkEnd w:id="182"/>
+    <w:bookmarkStart w:id="184" w:name="plano-de-aprendizagem-de-trinta-dias"/>
     <w:p>
       <w:pPr>
         <w:pStyle w:val="Heading1"/>
@@ -7311,7 +7411,7 @@
         <w:t xml:space="preserve">Um mês realista de leitura oficial, prática, trabalho de portfólio, e preparação de entrevista.*</w:t>
       </w:r>
     </w:p>
-    <w:bookmarkStart w:id="179" w:name="semana-foco-saída-exigida"/>
+    <w:bookmarkStart w:id="183" w:name="semana-foco-saída-exigida"/>
     <w:p>
       <w:pPr>
         <w:pStyle w:val="Heading2"/>
@@ -7372,9 +7472,9 @@
         <w:t xml:space="preserve">• Semana 4 • Ferramentas, relatórios, portfólio e entrevistas</w:t>
       </w:r>
     </w:p>
-    <w:bookmarkEnd w:id="179"/>
-    <w:bookmarkEnd w:id="180"/>
-    <w:bookmarkStart w:id="181" w:name="hábito-diário"/>
+    <w:bookmarkEnd w:id="183"/>
+    <w:bookmarkEnd w:id="184"/>
+    <w:bookmarkStart w:id="185" w:name="hábito-diário"/>
     <w:p>
       <w:pPr>
         <w:pStyle w:val="Heading1"/>
@@ -7423,8 +7523,8 @@
         <w:t xml:space="preserve">Escreva uma conclusão, ação corretiva ou lição.</w:t>
       </w:r>
     </w:p>
-    <w:bookmarkEnd w:id="181"/>
-    <w:bookmarkStart w:id="182" w:name="preparação-da-entrevista"/>
+    <w:bookmarkEnd w:id="185"/>
+    <w:bookmarkStart w:id="186" w:name="preparação-da-entrevista"/>
     <w:p>
       <w:pPr>
         <w:pStyle w:val="Heading1"/>
@@ -7445,8 +7545,8 @@
         <w:t xml:space="preserve">Respostas curtas e precisas para analistas e gerentes júnior.*</w:t>
       </w:r>
     </w:p>
-    <w:bookmarkEnd w:id="182"/>
-    <w:bookmarkStart w:id="183" w:name="o-que-é-nist-csf-2.0"/>
+    <w:bookmarkEnd w:id="186"/>
+    <w:bookmarkStart w:id="187" w:name="o-que-é-nist-csf-2.0"/>
     <w:p>
       <w:pPr>
         <w:pStyle w:val="Heading1"/>
@@ -7463,8 +7563,8 @@
         <w:t xml:space="preserve">Um framework flexível e focado em resultados que ajuda as organizações a entender, avaliar, priorizar e comunicar riscos de cibersegurança usando o Núcleo, Perfis, Níveis e recursos de suporte.</w:t>
       </w:r>
     </w:p>
-    <w:bookmarkEnd w:id="183"/>
-    <w:bookmarkStart w:id="184" w:name="quais-são-as-seis-funções"/>
+    <w:bookmarkEnd w:id="187"/>
+    <w:bookmarkStart w:id="188" w:name="quais-são-as-seis-funções"/>
     <w:p>
       <w:pPr>
         <w:pStyle w:val="Heading1"/>
@@ -7481,8 +7581,8 @@
         <w:t xml:space="preserve">Governar, Identificar, Proteger, Detectar, Responder e Recuperar.</w:t>
       </w:r>
     </w:p>
-    <w:bookmarkEnd w:id="184"/>
-    <w:bookmarkStart w:id="185" w:name="por-que-govern-foi-adicionado"/>
+    <w:bookmarkEnd w:id="188"/>
+    <w:bookmarkStart w:id="189" w:name="por-que-govern-foi-adicionado"/>
     <w:p>
       <w:pPr>
         <w:pStyle w:val="Heading1"/>
@@ -7499,8 +7599,8 @@
         <w:t xml:space="preserve">Torna explícita a responsabilização, política, estratégia de risco, integração empresa-risco, supervisão e risco de cadeia de suprimentos.</w:t>
       </w:r>
     </w:p>
-    <w:bookmarkEnd w:id="185"/>
-    <w:bookmarkStart w:id="186" w:name="o-que-é-um-perfil-atual"/>
+    <w:bookmarkEnd w:id="189"/>
+    <w:bookmarkStart w:id="190" w:name="o-que-é-um-perfil-atual"/>
     <w:p>
       <w:pPr>
         <w:pStyle w:val="Heading1"/>
@@ -7517,8 +7617,8 @@
         <w:t xml:space="preserve">Uma descrição dos resultados principais que um escopo definido está atualmente alcançando ou tentando alcançar, incluindo como ou em que medida.</w:t>
       </w:r>
     </w:p>
-    <w:bookmarkEnd w:id="186"/>
-    <w:bookmarkStart w:id="187" w:name="o-que-é-um-perfil-de-alvo"/>
+    <w:bookmarkEnd w:id="190"/>
+    <w:bookmarkStart w:id="191" w:name="o-que-é-um-perfil-de-alvo"/>
     <w:p>
       <w:pPr>
         <w:pStyle w:val="Heading1"/>
@@ -7535,8 +7635,8 @@
         <w:t xml:space="preserve">Os resultados principais priorizados a organização seleciona para um estado futuro definido com base em missão, risco, obrigações, stakeholders e recursos.</w:t>
       </w:r>
     </w:p>
-    <w:bookmarkEnd w:id="187"/>
-    <w:bookmarkStart w:id="188" w:name="o-que-são-tiers"/>
+    <w:bookmarkEnd w:id="191"/>
+    <w:bookmarkStart w:id="192" w:name="o-que-são-tiers"/>
     <w:p>
       <w:pPr>
         <w:pStyle w:val="Heading1"/>
@@ -7553,8 +7653,8 @@
         <w:t xml:space="preserve">Contexto para o rigor da governança e práticas de gestão de risco de cibersegurança: Partel, Risco Informado, Repetido e Adaptativo.</w:t>
       </w:r>
     </w:p>
-    <w:bookmarkEnd w:id="188"/>
-    <w:bookmarkStart w:id="189" w:name="csf-certifica-conformidade"/>
+    <w:bookmarkEnd w:id="192"/>
+    <w:bookmarkStart w:id="193" w:name="csf-certifica-conformidade"/>
     <w:p>
       <w:pPr>
         <w:pStyle w:val="Heading1"/>
@@ -7571,8 +7671,8 @@
         <w:t xml:space="preserve">Não. O alinhamento CSF não cria conformidade legal ou certificação NIST. As obrigações aplicáveis e os controlos executados devem ser avaliados separadamente.</w:t>
       </w:r>
     </w:p>
-    <w:bookmarkEnd w:id="189"/>
-    <w:bookmarkStart w:id="190" w:name="como-você-verifica-um-resultado"/>
+    <w:bookmarkEnd w:id="193"/>
+    <w:bookmarkStart w:id="194" w:name="como-você-verifica-um-resultado"/>
     <w:p>
       <w:pPr>
         <w:pStyle w:val="Heading1"/>
@@ -7589,8 +7689,8 @@
         <w:t xml:space="preserve">Defina escopo e critérios, avalie o desenho do controle, obtenha uma população completa, amostra por risco, inspecione e reflita, registre exceções, corrija, reteste e declare uma conclusão apoiada.</w:t>
       </w:r>
     </w:p>
-    <w:bookmarkEnd w:id="190"/>
-    <w:bookmarkStart w:id="191" w:name="como-devem-ser-usadas-ferramentas"/>
+    <w:bookmarkEnd w:id="194"/>
+    <w:bookmarkStart w:id="195" w:name="como-devem-ser-usadas-ferramentas"/>
     <w:p>
       <w:pPr>
         <w:pStyle w:val="Heading1"/>
@@ -7607,8 +7707,8 @@
         <w:t xml:space="preserve">Só com autorização e como uma fonte de provas. Validar cobertura e resultados, proteger saídas, corrigir lacunas confirmadas e reteste.</w:t>
       </w:r>
     </w:p>
-    <w:bookmarkEnd w:id="191"/>
-    <w:bookmarkStart w:id="192" w:name="como-você-prioriza-lacunas"/>
+    <w:bookmarkEnd w:id="195"/>
+    <w:bookmarkStart w:id="196" w:name="como-você-prioriza-lacunas"/>
     <w:p>
       <w:pPr>
         <w:pStyle w:val="Heading1"/>
@@ -7639,8 +7739,8 @@
         <w:t xml:space="preserve">O que se passa?</w:t>
       </w:r>
     </w:p>
-    <w:bookmarkEnd w:id="192"/>
-    <w:bookmarkStart w:id="193" w:name="modelos-e-listas-de-verificação"/>
+    <w:bookmarkEnd w:id="196"/>
+    <w:bookmarkStart w:id="197" w:name="modelos-e-listas-de-verificação"/>
     <w:p>
       <w:pPr>
         <w:pStyle w:val="Heading1"/>
@@ -7661,8 +7761,8 @@
         <w:t xml:space="preserve">Estruturas reutilizáveis para um sistema organizacional aprovado.*</w:t>
       </w:r>
     </w:p>
-    <w:bookmarkEnd w:id="193"/>
-    <w:bookmarkStart w:id="194" w:name="registro-de-perfil"/>
+    <w:bookmarkEnd w:id="197"/>
+    <w:bookmarkStart w:id="198" w:name="registro-de-perfil"/>
     <w:p>
       <w:pPr>
         <w:pStyle w:val="Heading1"/>
@@ -7759,8 +7859,8 @@
         <w:t xml:space="preserve">Histórico de aprovação e versão</w:t>
       </w:r>
     </w:p>
-    <w:bookmarkEnd w:id="194"/>
-    <w:bookmarkStart w:id="195" w:name="registro-de-risco"/>
+    <w:bookmarkEnd w:id="198"/>
+    <w:bookmarkStart w:id="199" w:name="registro-de-risco"/>
     <w:p>
       <w:pPr>
         <w:pStyle w:val="Heading1"/>
@@ -7846,8 +7946,8 @@
         <w:t xml:space="preserve">Indicador, gatilho de revisão, expiração de exceção e reteste</w:t>
       </w:r>
     </w:p>
-    <w:bookmarkEnd w:id="195"/>
-    <w:bookmarkStart w:id="196" w:name="folha-de-teste-de-controle"/>
+    <w:bookmarkEnd w:id="199"/>
+    <w:bookmarkStart w:id="200" w:name="folha-de-teste-de-controle"/>
     <w:p>
       <w:pPr>
         <w:pStyle w:val="Heading1"/>
@@ -7933,8 +8033,8 @@
         <w:t xml:space="preserve">Reteste, conclusão, limitações, revisor e aprovação</w:t>
       </w:r>
     </w:p>
-    <w:bookmarkEnd w:id="196"/>
-    <w:bookmarkStart w:id="198" w:name="avaliação-do-fornecedor"/>
+    <w:bookmarkEnd w:id="200"/>
+    <w:bookmarkStart w:id="202" w:name="avaliação-do-fornecedor"/>
     <w:p>
       <w:pPr>
         <w:pStyle w:val="Heading1"/>
@@ -7987,7 +8087,7 @@
         <w:t xml:space="preserve">Acompanhamento, descobertas, exceções, ações corretivas, exercícios, incidentes, mudanças, renovação e rescisão</w:t>
       </w:r>
     </w:p>
-    <w:bookmarkStart w:id="197" w:name="X386a5e99b0caadc9ef02f980db032f015f1af6f"/>
+    <w:bookmarkStart w:id="201" w:name="X386a5e99b0caadc9ef02f980db032f015f1af6f"/>
     <w:p>
       <w:pPr>
         <w:pStyle w:val="Heading2"/>
@@ -8095,9 +8195,9 @@
         <w:t xml:space="preserve">Excepções, aceitações, limitações e retestes visíveis para os tomadores de decisão</w:t>
       </w:r>
     </w:p>
-    <w:bookmarkEnd w:id="197"/>
-    <w:bookmarkEnd w:id="198"/>
-    <w:bookmarkStart w:id="199" w:name="glossário-e-índice-de-assuntos"/>
+    <w:bookmarkEnd w:id="201"/>
+    <w:bookmarkEnd w:id="202"/>
+    <w:bookmarkStart w:id="203" w:name="glossário-e-índice-de-assuntos"/>
     <w:p>
       <w:pPr>
         <w:pStyle w:val="Heading1"/>
@@ -8312,8 +8412,8 @@
         <w:t xml:space="preserve">Contexto para o rigor da governança de risco de cibersegurança e práticas de gestão de risco.</w:t>
       </w:r>
     </w:p>
-    <w:bookmarkEnd w:id="199"/>
-    <w:bookmarkStart w:id="201" w:name="índice-de-assunto"/>
+    <w:bookmarkEnd w:id="203"/>
+    <w:bookmarkStart w:id="205" w:name="índice-de-assunto"/>
     <w:p>
       <w:pPr>
         <w:pStyle w:val="Heading1"/>
@@ -8322,7 +8422,7 @@
         <w:t xml:space="preserve"># 23.1 Índice de assunto</w:t>
       </w:r>
     </w:p>
-    <w:bookmarkStart w:id="200" w:name="capítulos"/>
+    <w:bookmarkStart w:id="204" w:name="capítulos"/>
     <w:p>
       <w:pPr>
         <w:pStyle w:val="Heading2"/>
@@ -8399,9 +8499,9 @@
         <w:t xml:space="preserve">• Analista júnior . . . .</w:t>
       </w:r>
     </w:p>
-    <w:bookmarkEnd w:id="200"/>
-    <w:bookmarkEnd w:id="201"/>
-    <w:bookmarkStart w:id="216" w:name="referências-oficiais-e-estudo-adicional"/>
+    <w:bookmarkEnd w:id="204"/>
+    <w:bookmarkEnd w:id="205"/>
+    <w:bookmarkStart w:id="220" w:name="referências-oficiais-e-estudo-adicional"/>
     <w:p>
       <w:pPr>
         <w:pStyle w:val="Heading1"/>
@@ -8426,7 +8526,7 @@
       <w:pPr>
         <w:pStyle w:val="BodyText"/>
       </w:pPr>
-      <w:hyperlink r:id="rId202">
+      <w:hyperlink r:id="rId206">
         <w:r>
           <w:rPr>
             <w:rStyle w:val="Hyperlink"/>
@@ -8439,7 +8539,7 @@
       <w:pPr>
         <w:pStyle w:val="BodyText"/>
       </w:pPr>
-      <w:hyperlink r:id="rId203">
+      <w:hyperlink r:id="rId207">
         <w:r>
           <w:rPr>
             <w:rStyle w:val="Hyperlink"/>
@@ -8452,7 +8552,7 @@
       <w:pPr>
         <w:pStyle w:val="BodyText"/>
       </w:pPr>
-      <w:hyperlink r:id="rId157">
+      <w:hyperlink r:id="rId159">
         <w:r>
           <w:rPr>
             <w:rStyle w:val="Hyperlink"/>
@@ -8471,7 +8571,7 @@
       <w:pPr>
         <w:pStyle w:val="BodyText"/>
       </w:pPr>
-      <w:hyperlink r:id="rId204">
+      <w:hyperlink r:id="rId208">
         <w:r>
           <w:rPr>
             <w:rStyle w:val="Hyperlink"/>
@@ -8484,7 +8584,7 @@
       <w:pPr>
         <w:pStyle w:val="BodyText"/>
       </w:pPr>
-      <w:hyperlink r:id="rId158">
+      <w:hyperlink r:id="rId160">
         <w:r>
           <w:rPr>
             <w:rStyle w:val="Hyperlink"/>
@@ -8497,7 +8597,7 @@
       <w:pPr>
         <w:pStyle w:val="BodyText"/>
       </w:pPr>
-      <w:hyperlink r:id="rId205">
+      <w:hyperlink r:id="rId209">
         <w:r>
           <w:rPr>
             <w:rStyle w:val="Hyperlink"/>
@@ -8510,7 +8610,7 @@
       <w:pPr>
         <w:pStyle w:val="BodyText"/>
       </w:pPr>
-      <w:hyperlink r:id="rId206">
+      <w:hyperlink r:id="rId210">
         <w:r>
           <w:rPr>
             <w:rStyle w:val="Hyperlink"/>
@@ -8523,7 +8623,7 @@
       <w:pPr>
         <w:pStyle w:val="BodyText"/>
       </w:pPr>
-      <w:hyperlink r:id="rId207">
+      <w:hyperlink r:id="rId211">
         <w:r>
           <w:rPr>
             <w:rStyle w:val="Hyperlink"/>
@@ -8536,7 +8636,7 @@
       <w:pPr>
         <w:pStyle w:val="BodyText"/>
       </w:pPr>
-      <w:hyperlink r:id="rId208">
+      <w:hyperlink r:id="rId212">
         <w:r>
           <w:rPr>
             <w:rStyle w:val="Hyperlink"/>
@@ -8549,7 +8649,7 @@
       <w:pPr>
         <w:pStyle w:val="BodyText"/>
       </w:pPr>
-      <w:hyperlink r:id="rId209">
+      <w:hyperlink r:id="rId213">
         <w:r>
           <w:rPr>
             <w:rStyle w:val="Hyperlink"/>
@@ -8562,7 +8662,7 @@
       <w:pPr>
         <w:pStyle w:val="BodyText"/>
       </w:pPr>
-      <w:hyperlink r:id="rId210">
+      <w:hyperlink r:id="rId214">
         <w:r>
           <w:rPr>
             <w:rStyle w:val="Hyperlink"/>
@@ -8575,7 +8675,7 @@
       <w:pPr>
         <w:pStyle w:val="BodyText"/>
       </w:pPr>
-      <w:hyperlink r:id="rId211">
+      <w:hyperlink r:id="rId215">
         <w:r>
           <w:rPr>
             <w:rStyle w:val="Hyperlink"/>
@@ -8588,7 +8688,7 @@
       <w:pPr>
         <w:pStyle w:val="BodyText"/>
       </w:pPr>
-      <w:hyperlink r:id="rId212">
+      <w:hyperlink r:id="rId216">
         <w:r>
           <w:rPr>
             <w:rStyle w:val="Hyperlink"/>
@@ -8601,7 +8701,7 @@
       <w:pPr>
         <w:pStyle w:val="BodyText"/>
       </w:pPr>
-      <w:hyperlink r:id="rId213">
+      <w:hyperlink r:id="rId217">
         <w:r>
           <w:rPr>
             <w:rStyle w:val="Hyperlink"/>
@@ -8614,7 +8714,7 @@
       <w:pPr>
         <w:pStyle w:val="BodyText"/>
       </w:pPr>
-      <w:hyperlink r:id="rId214">
+      <w:hyperlink r:id="rId218">
         <w:r>
           <w:rPr>
             <w:rStyle w:val="Hyperlink"/>
@@ -8623,7 +8723,7 @@
         </w:r>
       </w:hyperlink>
     </w:p>
-    <w:bookmarkStart w:id="215" w:name="Xe3d0724cbc397f73548c5408409fe6e4a11d63b"/>
+    <w:bookmarkStart w:id="219" w:name="Xe3d0724cbc397f73548c5408409fe6e4a11d63b"/>
     <w:p>
       <w:pPr>
         <w:pStyle w:val="Heading2"/>
@@ -8642,8 +8742,8 @@
         <w:t xml:space="preserve">O núcleo CSF é estável, enquanto exemplos de implementação online, referências informativas, orientações, mapeamentos, ameaças, tecnologias e obrigações podem mudar. Verifique as fontes oficiais NIST e os requisitos específicos da organização antes de agir.</w:t>
       </w:r>
     </w:p>
-    <w:bookmarkEnd w:id="215"/>
-    <w:bookmarkEnd w:id="216"/>
+    <w:bookmarkEnd w:id="219"/>
+    <w:bookmarkEnd w:id="220"/>
     <w:sectPr/>
   </w:body>
 </w:document>

</xml_diff>